<commit_message>
update WIS2 Guide build
</commit_message>
<xml_diff>
--- a/cookbook/wis2-cookbook-DRAFT.docx
+++ b/cookbook/wis2-cookbook-DRAFT.docx
@@ -21,7 +21,7 @@
         <w:pStyle w:val="Date"/>
       </w:pPr>
       <w:r>
-        <w:t xml:space="preserve">2026-02-03</w:t>
+        <w:t xml:space="preserve">2026-03-13</w:t>
       </w:r>
     </w:p>
     <w:p>
@@ -74,7 +74,7 @@
               <w:jc w:val="left"/>
             </w:pPr>
             <w:r>
-              <w:t xml:space="preserve">Date: 2026-02-03</w:t>
+              <w:t xml:space="preserve">Date: 2026-03-13</w:t>
             </w:r>
           </w:p>
         </w:tc>
@@ -102,6 +102,30 @@
             <w:r>
               <w:t xml:space="preserve">Document status: DRAFT</w:t>
             </w:r>
+          </w:p>
+        </w:tc>
+      </w:tr>
+      <w:tr>
+        <w:tc>
+          <w:tcPr/>
+          <w:p>
+            <w:pPr>
+              <w:jc w:val="left"/>
+            </w:pPr>
+            <w:r>
+              <w:t xml:space="preserve">Revision history: see</w:t>
+            </w:r>
+            <w:r>
+              <w:t xml:space="preserve"> </w:t>
+            </w:r>
+            <w:hyperlink w:anchor="X7704236ba72ed8cc2b9a9e238d27c640b9b6528">
+              <w:r>
+                <w:rPr>
+                  <w:rStyle w:val="Hyperlink"/>
+                </w:rPr>
+                <w:t xml:space="preserve">Annex A</w:t>
+              </w:r>
+            </w:hyperlink>
           </w:p>
         </w:tc>
       </w:tr>
@@ -16095,6 +16119,153 @@
     <w:bookmarkEnd w:id="142"/>
     <w:bookmarkEnd w:id="143"/>
     <w:bookmarkEnd w:id="144"/>
+    <w:bookmarkStart w:id="145" w:name="X7704236ba72ed8cc2b9a9e238d27c640b9b6528"/>
+    <w:p>
+      <w:pPr>
+        <w:pStyle w:val="Heading1"/>
+      </w:pPr>
+      <w:r>
+        <w:t xml:space="preserve">Revision History</w:t>
+      </w:r>
+    </w:p>
+    <w:tbl>
+      <w:tblPr>
+        <w:tblStyle w:val="Table"/>
+        <w:tblW w:type="pct" w:w="5000"/>
+        <w:tblLook w:firstRow="1" w:lastRow="0" w:firstColumn="0" w:lastColumn="0" w:noHBand="0" w:noVBand="0" w:val="0020"/>
+        <w:jc w:val="start"/>
+      </w:tblPr>
+      <w:tblGrid>
+        <w:gridCol w:w="950"/>
+        <w:gridCol w:w="1425"/>
+        <w:gridCol w:w="950"/>
+        <w:gridCol w:w="950"/>
+        <w:gridCol w:w="3643"/>
+      </w:tblGrid>
+      <w:tr>
+        <w:trPr>
+          <w:tblHeader w:val="true"/>
+        </w:trPr>
+        <w:tc>
+          <w:tcPr/>
+          <w:p>
+            <w:pPr>
+              <w:pStyle w:val="Compact"/>
+              <w:jc w:val="left"/>
+            </w:pPr>
+            <w:r>
+              <w:t xml:space="preserve">Date</w:t>
+            </w:r>
+          </w:p>
+        </w:tc>
+        <w:tc>
+          <w:tcPr/>
+          <w:p>
+            <w:pPr>
+              <w:pStyle w:val="Compact"/>
+              <w:jc w:val="left"/>
+            </w:pPr>
+            <w:r>
+              <w:t xml:space="preserve">Release</w:t>
+            </w:r>
+          </w:p>
+        </w:tc>
+        <w:tc>
+          <w:tcPr/>
+          <w:p>
+            <w:pPr>
+              <w:pStyle w:val="Compact"/>
+              <w:jc w:val="left"/>
+            </w:pPr>
+            <w:r>
+              <w:t xml:space="preserve">Proposed by</w:t>
+            </w:r>
+          </w:p>
+        </w:tc>
+        <w:tc>
+          <w:tcPr/>
+          <w:p>
+            <w:pPr>
+              <w:pStyle w:val="Compact"/>
+              <w:jc w:val="left"/>
+            </w:pPr>
+            <w:r>
+              <w:t xml:space="preserve">Primary clauses modified</w:t>
+            </w:r>
+          </w:p>
+        </w:tc>
+        <w:tc>
+          <w:tcPr/>
+          <w:p>
+            <w:pPr>
+              <w:pStyle w:val="Compact"/>
+              <w:jc w:val="left"/>
+            </w:pPr>
+            <w:r>
+              <w:t xml:space="preserve">Approved by</w:t>
+            </w:r>
+          </w:p>
+        </w:tc>
+      </w:tr>
+      <w:tr>
+        <w:tc>
+          <w:tcPr/>
+          <w:p>
+            <w:pPr>
+              <w:jc w:val="left"/>
+            </w:pPr>
+            <w:r>
+              <w:t xml:space="preserve">December 2025</w:t>
+            </w:r>
+          </w:p>
+        </w:tc>
+        <w:tc>
+          <w:tcPr/>
+          <w:p>
+            <w:pPr>
+              <w:jc w:val="left"/>
+            </w:pPr>
+            <w:r>
+              <w:t xml:space="preserve">1.0.0</w:t>
+            </w:r>
+          </w:p>
+        </w:tc>
+        <w:tc>
+          <w:tcPr/>
+          <w:p>
+            <w:pPr>
+              <w:jc w:val="left"/>
+            </w:pPr>
+            <w:r>
+              <w:t xml:space="preserve">SC-IMT</w:t>
+            </w:r>
+          </w:p>
+        </w:tc>
+        <w:tc>
+          <w:tcPr/>
+          <w:p>
+            <w:pPr>
+              <w:jc w:val="left"/>
+            </w:pPr>
+            <w:r>
+              <w:t xml:space="preserve">Initial approval for publication</w:t>
+            </w:r>
+          </w:p>
+        </w:tc>
+        <w:tc>
+          <w:tcPr/>
+          <w:p>
+            <w:pPr>
+              <w:jc w:val="left"/>
+            </w:pPr>
+            <w:r>
+              <w:t xml:space="preserve">SC-IMT</w:t>
+            </w:r>
+          </w:p>
+        </w:tc>
+      </w:tr>
+    </w:tbl>
+    <w:bookmarkEnd w:id="145"/>
     <w:sectPr/>
   </w:body>
 </w:document>

</xml_diff>